<commit_message>
docs 16/10: confidence-interval wording removed from the docx reports (owner, 23/10); duplicate bookmark ids of the Pulse report renumbered
</commit_message>
<xml_diff>
--- a/docs/Bao_cao_Sentinel_Pulse.docx
+++ b/docs/Bao_cao_Sentinel_Pulse.docx
@@ -519,16 +519,6 @@
             <w:szCs w:val="28"/>
           </w:rPr>
           <w:t xml:space="preserve">1. Tóm tắt nhanh</w:t>
-        </w:r>
-        <w:r>
-          <w:rPr>
-            <w:rFonts w:ascii="Arial" w:cs="Arial" w:eastAsia="Arial" w:hAnsi="Arial"/>
-            <w:b/>
-            <w:bCs/>
-            <w:color w:val="000000"/>
-            <w:sz w:val="28"/>
-            <w:szCs w:val="28"/>
-          </w:rPr>
           <w:tab/>
           <w:t xml:space="preserve">3</w:t>
         </w:r>
@@ -553,16 +543,6 @@
             <w:szCs w:val="28"/>
           </w:rPr>
           <w:t xml:space="preserve">2. Pulse hoạt động như thế nào</w:t>
-        </w:r>
-        <w:r>
-          <w:rPr>
-            <w:rFonts w:ascii="Arial" w:cs="Arial" w:eastAsia="Arial" w:hAnsi="Arial"/>
-            <w:b/>
-            <w:bCs/>
-            <w:color w:val="000000"/>
-            <w:sz w:val="28"/>
-            <w:szCs w:val="28"/>
-          </w:rPr>
           <w:tab/>
           <w:t xml:space="preserve">3</w:t>
         </w:r>
@@ -587,16 +567,6 @@
             <w:szCs w:val="28"/>
           </w:rPr>
           <w:t xml:space="preserve">2.1 Ý tưởng chính</w:t>
-        </w:r>
-        <w:r>
-          <w:rPr>
-            <w:rFonts w:ascii="Arial" w:cs="Arial" w:eastAsia="Arial" w:hAnsi="Arial"/>
-            <w:b w:val="false"/>
-            <w:bCs w:val="false"/>
-            <w:color w:val="000000"/>
-            <w:sz w:val="28"/>
-            <w:szCs w:val="28"/>
-          </w:rPr>
           <w:tab/>
           <w:t xml:space="preserve">3</w:t>
         </w:r>
@@ -621,16 +591,6 @@
             <w:szCs w:val="28"/>
           </w:rPr>
           <w:t xml:space="preserve">2.2 Các bước xử lý</w:t>
-        </w:r>
-        <w:r>
-          <w:rPr>
-            <w:rFonts w:ascii="Arial" w:cs="Arial" w:eastAsia="Arial" w:hAnsi="Arial"/>
-            <w:b w:val="false"/>
-            <w:bCs w:val="false"/>
-            <w:color w:val="000000"/>
-            <w:sz w:val="28"/>
-            <w:szCs w:val="28"/>
-          </w:rPr>
           <w:tab/>
           <w:t xml:space="preserve">3</w:t>
         </w:r>
@@ -655,16 +615,6 @@
             <w:szCs w:val="28"/>
           </w:rPr>
           <w:t xml:space="preserve">2.3 249 con số gồm những gì</w:t>
-        </w:r>
-        <w:r>
-          <w:rPr>
-            <w:rFonts w:ascii="Arial" w:cs="Arial" w:eastAsia="Arial" w:hAnsi="Arial"/>
-            <w:b w:val="false"/>
-            <w:bCs w:val="false"/>
-            <w:color w:val="000000"/>
-            <w:sz w:val="28"/>
-            <w:szCs w:val="28"/>
-          </w:rPr>
           <w:tab/>
           <w:t xml:space="preserve">4</w:t>
         </w:r>
@@ -689,16 +639,6 @@
             <w:szCs w:val="28"/>
           </w:rPr>
           <w:t xml:space="preserve">2.4 Hai mô hình và cách gộp điểm</w:t>
-        </w:r>
-        <w:r>
-          <w:rPr>
-            <w:rFonts w:ascii="Arial" w:cs="Arial" w:eastAsia="Arial" w:hAnsi="Arial"/>
-            <w:b w:val="false"/>
-            <w:bCs w:val="false"/>
-            <w:color w:val="000000"/>
-            <w:sz w:val="28"/>
-            <w:szCs w:val="28"/>
-          </w:rPr>
           <w:tab/>
           <w:t xml:space="preserve">4</w:t>
         </w:r>
@@ -723,16 +663,6 @@
             <w:szCs w:val="28"/>
           </w:rPr>
           <w:t xml:space="preserve">3. Tình trạng hiện tại</w:t>
-        </w:r>
-        <w:r>
-          <w:rPr>
-            <w:rFonts w:ascii="Arial" w:cs="Arial" w:eastAsia="Arial" w:hAnsi="Arial"/>
-            <w:b/>
-            <w:bCs/>
-            <w:color w:val="000000"/>
-            <w:sz w:val="28"/>
-            <w:szCs w:val="28"/>
-          </w:rPr>
           <w:tab/>
           <w:t xml:space="preserve">5</w:t>
         </w:r>
@@ -757,16 +687,6 @@
             <w:szCs w:val="28"/>
           </w:rPr>
           <w:t xml:space="preserve">3.1 Chế độ chạy thử</w:t>
-        </w:r>
-        <w:r>
-          <w:rPr>
-            <w:rFonts w:ascii="Arial" w:cs="Arial" w:eastAsia="Arial" w:hAnsi="Arial"/>
-            <w:b w:val="false"/>
-            <w:bCs w:val="false"/>
-            <w:color w:val="000000"/>
-            <w:sz w:val="28"/>
-            <w:szCs w:val="28"/>
-          </w:rPr>
           <w:tab/>
           <w:t xml:space="preserve">5</w:t>
         </w:r>
@@ -791,16 +711,6 @@
             <w:szCs w:val="28"/>
           </w:rPr>
           <w:t xml:space="preserve">3.2 Ba máy worker</w:t>
-        </w:r>
-        <w:r>
-          <w:rPr>
-            <w:rFonts w:ascii="Arial" w:cs="Arial" w:eastAsia="Arial" w:hAnsi="Arial"/>
-            <w:b w:val="false"/>
-            <w:bCs w:val="false"/>
-            <w:color w:val="000000"/>
-            <w:sz w:val="28"/>
-            <w:szCs w:val="28"/>
-          </w:rPr>
           <w:tab/>
           <w:t xml:space="preserve">5</w:t>
         </w:r>
@@ -825,16 +735,6 @@
             <w:szCs w:val="28"/>
           </w:rPr>
           <w:t xml:space="preserve">3.3 Tự phục hồi khi có lỗi</w:t>
-        </w:r>
-        <w:r>
-          <w:rPr>
-            <w:rFonts w:ascii="Arial" w:cs="Arial" w:eastAsia="Arial" w:hAnsi="Arial"/>
-            <w:b w:val="false"/>
-            <w:bCs w:val="false"/>
-            <w:color w:val="000000"/>
-            <w:sz w:val="28"/>
-            <w:szCs w:val="28"/>
-          </w:rPr>
           <w:tab/>
           <w:t xml:space="preserve">5</w:t>
         </w:r>
@@ -859,16 +759,6 @@
             <w:szCs w:val="28"/>
           </w:rPr>
           <w:t xml:space="preserve">3.4 Độ trễ trong một mẫu ngắn</w:t>
-        </w:r>
-        <w:r>
-          <w:rPr>
-            <w:rFonts w:ascii="Arial" w:cs="Arial" w:eastAsia="Arial" w:hAnsi="Arial"/>
-            <w:b w:val="false"/>
-            <w:bCs w:val="false"/>
-            <w:color w:val="000000"/>
-            <w:sz w:val="28"/>
-            <w:szCs w:val="28"/>
-          </w:rPr>
           <w:tab/>
           <w:t xml:space="preserve">6</w:t>
         </w:r>
@@ -893,16 +783,6 @@
             <w:szCs w:val="28"/>
           </w:rPr>
           <w:t xml:space="preserve">3.5 Một khoảng bị tác động bởi thử nghiệm RCA</w:t>
-        </w:r>
-        <w:r>
-          <w:rPr>
-            <w:rFonts w:ascii="Arial" w:cs="Arial" w:eastAsia="Arial" w:hAnsi="Arial"/>
-            <w:b w:val="false"/>
-            <w:bCs w:val="false"/>
-            <w:color w:val="000000"/>
-            <w:sz w:val="28"/>
-            <w:szCs w:val="28"/>
-          </w:rPr>
           <w:tab/>
           <w:t xml:space="preserve">6</w:t>
         </w:r>
@@ -927,16 +807,6 @@
             <w:szCs w:val="28"/>
           </w:rPr>
           <w:t xml:space="preserve">4. Kết quả đã có</w:t>
-        </w:r>
-        <w:r>
-          <w:rPr>
-            <w:rFonts w:ascii="Arial" w:cs="Arial" w:eastAsia="Arial" w:hAnsi="Arial"/>
-            <w:b/>
-            <w:bCs/>
-            <w:color w:val="000000"/>
-            <w:sz w:val="28"/>
-            <w:szCs w:val="28"/>
-          </w:rPr>
           <w:tab/>
           <w:t xml:space="preserve">6</w:t>
         </w:r>
@@ -961,16 +831,6 @@
             <w:szCs w:val="28"/>
           </w:rPr>
           <w:t xml:space="preserve">4.1 Thu dữ liệu bình thường 24 giờ</w:t>
-        </w:r>
-        <w:r>
-          <w:rPr>
-            <w:rFonts w:ascii="Arial" w:cs="Arial" w:eastAsia="Arial" w:hAnsi="Arial"/>
-            <w:b w:val="false"/>
-            <w:bCs w:val="false"/>
-            <w:color w:val="000000"/>
-            <w:sz w:val="28"/>
-            <w:szCs w:val="28"/>
-          </w:rPr>
           <w:tab/>
           <w:t xml:space="preserve">6</w:t>
         </w:r>
@@ -995,16 +855,6 @@
             <w:szCs w:val="28"/>
           </w:rPr>
           <w:t xml:space="preserve">4.2 Thử tấn công giả lập, đợt 1</w:t>
-        </w:r>
-        <w:r>
-          <w:rPr>
-            <w:rFonts w:ascii="Arial" w:cs="Arial" w:eastAsia="Arial" w:hAnsi="Arial"/>
-            <w:b w:val="false"/>
-            <w:bCs w:val="false"/>
-            <w:color w:val="000000"/>
-            <w:sz w:val="28"/>
-            <w:szCs w:val="28"/>
-          </w:rPr>
           <w:tab/>
           <w:t xml:space="preserve">7</w:t>
         </w:r>
@@ -1029,16 +879,6 @@
             <w:szCs w:val="28"/>
           </w:rPr>
           <w:t xml:space="preserve">4.3 Thử bổ sung cho RabbitMQ</w:t>
-        </w:r>
-        <w:r>
-          <w:rPr>
-            <w:rFonts w:ascii="Arial" w:cs="Arial" w:eastAsia="Arial" w:hAnsi="Arial"/>
-            <w:b w:val="false"/>
-            <w:bCs w:val="false"/>
-            <w:color w:val="000000"/>
-            <w:sz w:val="28"/>
-            <w:szCs w:val="28"/>
-          </w:rPr>
           <w:tab/>
           <w:t xml:space="preserve">7</w:t>
         </w:r>
@@ -1063,16 +903,6 @@
             <w:szCs w:val="28"/>
           </w:rPr>
           <w:t xml:space="preserve">5. Còn thiếu gì</w:t>
-        </w:r>
-        <w:r>
-          <w:rPr>
-            <w:rFonts w:ascii="Arial" w:cs="Arial" w:eastAsia="Arial" w:hAnsi="Arial"/>
-            <w:b/>
-            <w:bCs/>
-            <w:color w:val="000000"/>
-            <w:sz w:val="28"/>
-            <w:szCs w:val="28"/>
-          </w:rPr>
           <w:tab/>
           <w:t xml:space="preserve">8</w:t>
         </w:r>
@@ -1097,16 +927,6 @@
             <w:szCs w:val="28"/>
           </w:rPr>
           <w:t xml:space="preserve">5.1 Mục tiêu đã đăng ký</w:t>
-        </w:r>
-        <w:r>
-          <w:rPr>
-            <w:rFonts w:ascii="Arial" w:cs="Arial" w:eastAsia="Arial" w:hAnsi="Arial"/>
-            <w:b w:val="false"/>
-            <w:bCs w:val="false"/>
-            <w:color w:val="000000"/>
-            <w:sz w:val="28"/>
-            <w:szCs w:val="28"/>
-          </w:rPr>
           <w:tab/>
           <w:t xml:space="preserve">8</w:t>
         </w:r>
@@ -1131,16 +951,6 @@
             <w:szCs w:val="28"/>
           </w:rPr>
           <w:t xml:space="preserve">5.2 Nguyên tắc</w:t>
-        </w:r>
-        <w:r>
-          <w:rPr>
-            <w:rFonts w:ascii="Arial" w:cs="Arial" w:eastAsia="Arial" w:hAnsi="Arial"/>
-            <w:b w:val="false"/>
-            <w:bCs w:val="false"/>
-            <w:color w:val="000000"/>
-            <w:sz w:val="28"/>
-            <w:szCs w:val="28"/>
-          </w:rPr>
           <w:tab/>
           <w:t xml:space="preserve">9</w:t>
         </w:r>
@@ -1165,16 +975,6 @@
             <w:szCs w:val="28"/>
           </w:rPr>
           <w:t xml:space="preserve">6. Giải thích thuật ngữ</w:t>
-        </w:r>
-        <w:r>
-          <w:rPr>
-            <w:rFonts w:ascii="Arial" w:cs="Arial" w:eastAsia="Arial" w:hAnsi="Arial"/>
-            <w:b/>
-            <w:bCs/>
-            <w:color w:val="000000"/>
-            <w:sz w:val="28"/>
-            <w:szCs w:val="28"/>
-          </w:rPr>
           <w:tab/>
           <w:t xml:space="preserve">9</w:t>
         </w:r>
@@ -1199,16 +999,6 @@
             <w:szCs w:val="28"/>
           </w:rPr>
           <w:t xml:space="preserve">7. Tài liệu tham chiếu</w:t>
-        </w:r>
-        <w:r>
-          <w:rPr>
-            <w:rFonts w:ascii="Arial" w:cs="Arial" w:eastAsia="Arial" w:hAnsi="Arial"/>
-            <w:b/>
-            <w:bCs/>
-            <w:color w:val="000000"/>
-            <w:sz w:val="28"/>
-            <w:szCs w:val="28"/>
-          </w:rPr>
           <w:tab/>
           <w:t xml:space="preserve">10</w:t>
         </w:r>
@@ -1233,16 +1023,6 @@
             <w:szCs w:val="28"/>
           </w:rPr>
           <w:t xml:space="preserve">7.1 Mã nguồn và kết quả</w:t>
-        </w:r>
-        <w:r>
-          <w:rPr>
-            <w:rFonts w:ascii="Arial" w:cs="Arial" w:eastAsia="Arial" w:hAnsi="Arial"/>
-            <w:b w:val="false"/>
-            <w:bCs w:val="false"/>
-            <w:color w:val="000000"/>
-            <w:sz w:val="28"/>
-            <w:szCs w:val="28"/>
-          </w:rPr>
           <w:tab/>
           <w:t xml:space="preserve">10</w:t>
         </w:r>
@@ -1267,16 +1047,6 @@
             <w:szCs w:val="28"/>
           </w:rPr>
           <w:t xml:space="preserve">7.2 Lệnh kiểm tra (chỉ đọc, không khởi động lại)</w:t>
-        </w:r>
-        <w:r>
-          <w:rPr>
-            <w:rFonts w:ascii="Arial" w:cs="Arial" w:eastAsia="Arial" w:hAnsi="Arial"/>
-            <w:b w:val="false"/>
-            <w:bCs w:val="false"/>
-            <w:color w:val="000000"/>
-            <w:sz w:val="28"/>
-            <w:szCs w:val="28"/>
-          </w:rPr>
           <w:tab/>
           <w:t xml:space="preserve">10</w:t>
         </w:r>
@@ -1301,16 +1071,6 @@
             <w:szCs w:val="28"/>
           </w:rPr>
           <w:t xml:space="preserve">8. Lưu ý khi đọc kết quả</w:t>
-        </w:r>
-        <w:r>
-          <w:rPr>
-            <w:rFonts w:ascii="Arial" w:cs="Arial" w:eastAsia="Arial" w:hAnsi="Arial"/>
-            <w:b/>
-            <w:bCs/>
-            <w:color w:val="000000"/>
-            <w:sz w:val="28"/>
-            <w:szCs w:val="28"/>
-          </w:rPr>
           <w:tab/>
           <w:t xml:space="preserve">10</w:t>
         </w:r>
@@ -1581,7 +1341,7 @@
         <w:keepNext/>
         <w:spacing w:after="160" w:before="360"/>
       </w:pPr>
-      <w:bookmarkStart w:name="h1" w:id="1"/>
+      <w:bookmarkStart w:name="h1" w:id="2"/>
       <w:r>
         <w:rPr>
           <w:rFonts w:ascii="Arial" w:cs="Arial" w:eastAsia="Arial" w:hAnsi="Arial"/>
@@ -1593,7 +1353,7 @@
         </w:rPr>
         <w:t xml:space="preserve">2. Pulse hoạt động như thế nào</w:t>
       </w:r>
-      <w:bookmarkEnd w:id="1"/>
+      <w:bookmarkEnd w:id="2"/>
     </w:p>
     <w:p>
       <w:pPr>
@@ -1601,7 +1361,7 @@
         <w:keepNext/>
         <w:spacing w:after="120" w:before="240"/>
       </w:pPr>
-      <w:bookmarkStart w:name="h2" w:id="1"/>
+      <w:bookmarkStart w:name="h2" w:id="3"/>
       <w:r>
         <w:rPr>
           <w:rFonts w:ascii="Arial" w:cs="Arial" w:eastAsia="Arial" w:hAnsi="Arial"/>
@@ -1613,7 +1373,7 @@
         </w:rPr>
         <w:t xml:space="preserve">2.1 Ý tưởng chính</w:t>
       </w:r>
-      <w:bookmarkEnd w:id="1"/>
+      <w:bookmarkEnd w:id="3"/>
     </w:p>
     <w:p>
       <w:pPr>
@@ -1636,7 +1396,7 @@
         <w:keepNext/>
         <w:spacing w:after="120" w:before="240"/>
       </w:pPr>
-      <w:bookmarkStart w:name="h3" w:id="1"/>
+      <w:bookmarkStart w:name="h3" w:id="4"/>
       <w:r>
         <w:rPr>
           <w:rFonts w:ascii="Arial" w:cs="Arial" w:eastAsia="Arial" w:hAnsi="Arial"/>
@@ -1648,7 +1408,7 @@
         </w:rPr>
         <w:t xml:space="preserve">2.2 Các bước xử lý</w:t>
       </w:r>
-      <w:bookmarkEnd w:id="1"/>
+      <w:bookmarkEnd w:id="4"/>
     </w:p>
     <w:p>
       <w:pPr>
@@ -1808,7 +1568,7 @@
         <w:keepNext/>
         <w:spacing w:after="120" w:before="240"/>
       </w:pPr>
-      <w:bookmarkStart w:name="h4" w:id="1"/>
+      <w:bookmarkStart w:name="h4" w:id="5"/>
       <w:r>
         <w:rPr>
           <w:rFonts w:ascii="Arial" w:cs="Arial" w:eastAsia="Arial" w:hAnsi="Arial"/>
@@ -1820,7 +1580,7 @@
         </w:rPr>
         <w:t xml:space="preserve">2.3 249 con số gồm những gì</w:t>
       </w:r>
-      <w:bookmarkEnd w:id="1"/>
+      <w:bookmarkEnd w:id="5"/>
     </w:p>
     <w:tbl>
       <w:tblPr>
@@ -2743,7 +2503,7 @@
         <w:keepNext/>
         <w:spacing w:after="120" w:before="240"/>
       </w:pPr>
-      <w:bookmarkStart w:name="h5" w:id="1"/>
+      <w:bookmarkStart w:name="h5" w:id="6"/>
       <w:r>
         <w:rPr>
           <w:rFonts w:ascii="Arial" w:cs="Arial" w:eastAsia="Arial" w:hAnsi="Arial"/>
@@ -2755,7 +2515,7 @@
         </w:rPr>
         <w:t xml:space="preserve">2.4 Hai mô hình và cách gộp điểm</w:t>
       </w:r>
-      <w:bookmarkEnd w:id="1"/>
+      <w:bookmarkEnd w:id="6"/>
     </w:p>
     <w:p>
       <w:pPr>
@@ -2917,7 +2677,7 @@
         <w:keepNext/>
         <w:spacing w:after="160" w:before="360"/>
       </w:pPr>
-      <w:bookmarkStart w:name="h6" w:id="1"/>
+      <w:bookmarkStart w:name="h6" w:id="7"/>
       <w:r>
         <w:rPr>
           <w:rFonts w:ascii="Arial" w:cs="Arial" w:eastAsia="Arial" w:hAnsi="Arial"/>
@@ -2929,7 +2689,7 @@
         </w:rPr>
         <w:t xml:space="preserve">3. Tình trạng hiện tại</w:t>
       </w:r>
-      <w:bookmarkEnd w:id="1"/>
+      <w:bookmarkEnd w:id="7"/>
     </w:p>
     <w:p>
       <w:pPr>
@@ -2937,7 +2697,7 @@
         <w:keepNext/>
         <w:spacing w:after="120" w:before="240"/>
       </w:pPr>
-      <w:bookmarkStart w:name="h7" w:id="1"/>
+      <w:bookmarkStart w:name="h7" w:id="8"/>
       <w:r>
         <w:rPr>
           <w:rFonts w:ascii="Arial" w:cs="Arial" w:eastAsia="Arial" w:hAnsi="Arial"/>
@@ -2949,7 +2709,7 @@
         </w:rPr>
         <w:t xml:space="preserve">3.1 Chế độ chạy thử</w:t>
       </w:r>
-      <w:bookmarkEnd w:id="1"/>
+      <w:bookmarkEnd w:id="8"/>
     </w:p>
     <w:p>
       <w:pPr>
@@ -2972,7 +2732,7 @@
         <w:keepNext/>
         <w:spacing w:after="120" w:before="240"/>
       </w:pPr>
-      <w:bookmarkStart w:name="h8" w:id="1"/>
+      <w:bookmarkStart w:name="h8" w:id="9"/>
       <w:r>
         <w:rPr>
           <w:rFonts w:ascii="Arial" w:cs="Arial" w:eastAsia="Arial" w:hAnsi="Arial"/>
@@ -2984,7 +2744,7 @@
         </w:rPr>
         <w:t xml:space="preserve">3.2 Ba máy worker</w:t>
       </w:r>
-      <w:bookmarkEnd w:id="1"/>
+      <w:bookmarkEnd w:id="9"/>
     </w:p>
     <w:p>
       <w:pPr>
@@ -3787,7 +3547,7 @@
         <w:keepNext/>
         <w:spacing w:after="120" w:before="240"/>
       </w:pPr>
-      <w:bookmarkStart w:name="h9" w:id="1"/>
+      <w:bookmarkStart w:name="h9" w:id="10"/>
       <w:r>
         <w:rPr>
           <w:rFonts w:ascii="Arial" w:cs="Arial" w:eastAsia="Arial" w:hAnsi="Arial"/>
@@ -3799,7 +3559,7 @@
         </w:rPr>
         <w:t xml:space="preserve">3.3 Tự phục hồi khi có lỗi</w:t>
       </w:r>
-      <w:bookmarkEnd w:id="1"/>
+      <w:bookmarkEnd w:id="10"/>
     </w:p>
     <w:p>
       <w:pPr>
@@ -3967,7 +3727,7 @@
         <w:keepNext/>
         <w:spacing w:after="120" w:before="240"/>
       </w:pPr>
-      <w:bookmarkStart w:name="h10" w:id="1"/>
+      <w:bookmarkStart w:name="h10" w:id="11"/>
       <w:r>
         <w:rPr>
           <w:rFonts w:ascii="Arial" w:cs="Arial" w:eastAsia="Arial" w:hAnsi="Arial"/>
@@ -3979,7 +3739,7 @@
         </w:rPr>
         <w:t xml:space="preserve">3.4 Độ trễ trong một mẫu ngắn</w:t>
       </w:r>
-      <w:bookmarkEnd w:id="1"/>
+      <w:bookmarkEnd w:id="11"/>
     </w:p>
     <w:p>
       <w:pPr>
@@ -4427,7 +4187,7 @@
         <w:keepNext/>
         <w:spacing w:after="120" w:before="240"/>
       </w:pPr>
-      <w:bookmarkStart w:name="h11" w:id="1"/>
+      <w:bookmarkStart w:name="h11" w:id="12"/>
       <w:r>
         <w:rPr>
           <w:rFonts w:ascii="Arial" w:cs="Arial" w:eastAsia="Arial" w:hAnsi="Arial"/>
@@ -4439,7 +4199,7 @@
         </w:rPr>
         <w:t xml:space="preserve">3.5 Một khoảng bị tác động bởi thử nghiệm RCA</w:t>
       </w:r>
-      <w:bookmarkEnd w:id="1"/>
+      <w:bookmarkEnd w:id="12"/>
     </w:p>
     <w:p>
       <w:pPr>
@@ -4462,7 +4222,7 @@
         <w:keepNext/>
         <w:spacing w:after="160" w:before="360"/>
       </w:pPr>
-      <w:bookmarkStart w:name="h12" w:id="1"/>
+      <w:bookmarkStart w:name="h12" w:id="13"/>
       <w:r>
         <w:rPr>
           <w:rFonts w:ascii="Arial" w:cs="Arial" w:eastAsia="Arial" w:hAnsi="Arial"/>
@@ -4474,7 +4234,7 @@
         </w:rPr>
         <w:t xml:space="preserve">4. Kết quả đã có</w:t>
       </w:r>
-      <w:bookmarkEnd w:id="1"/>
+      <w:bookmarkEnd w:id="13"/>
     </w:p>
     <w:p>
       <w:pPr>
@@ -4482,7 +4242,7 @@
         <w:keepNext/>
         <w:spacing w:after="120" w:before="240"/>
       </w:pPr>
-      <w:bookmarkStart w:name="h13" w:id="1"/>
+      <w:bookmarkStart w:name="h13" w:id="14"/>
       <w:r>
         <w:rPr>
           <w:rFonts w:ascii="Arial" w:cs="Arial" w:eastAsia="Arial" w:hAnsi="Arial"/>
@@ -4494,7 +4254,7 @@
         </w:rPr>
         <w:t xml:space="preserve">4.1 Thu dữ liệu bình thường 24 giờ</w:t>
       </w:r>
-      <w:bookmarkEnd w:id="1"/>
+      <w:bookmarkEnd w:id="14"/>
     </w:p>
     <w:p>
       <w:pPr>
@@ -4617,7 +4377,7 @@
         <w:keepNext/>
         <w:spacing w:after="120" w:before="240"/>
       </w:pPr>
-      <w:bookmarkStart w:name="h14" w:id="1"/>
+      <w:bookmarkStart w:name="h14" w:id="15"/>
       <w:r>
         <w:rPr>
           <w:rFonts w:ascii="Arial" w:cs="Arial" w:eastAsia="Arial" w:hAnsi="Arial"/>
@@ -4629,7 +4389,7 @@
         </w:rPr>
         <w:t xml:space="preserve">4.2 Thử tấn công giả lập, đợt 1</w:t>
       </w:r>
-      <w:bookmarkEnd w:id="1"/>
+      <w:bookmarkEnd w:id="15"/>
     </w:p>
     <w:p>
       <w:pPr>
@@ -5267,7 +5027,7 @@
         <w:keepNext/>
         <w:spacing w:after="120" w:before="240"/>
       </w:pPr>
-      <w:bookmarkStart w:name="h15" w:id="1"/>
+      <w:bookmarkStart w:name="h15" w:id="16"/>
       <w:r>
         <w:rPr>
           <w:rFonts w:ascii="Arial" w:cs="Arial" w:eastAsia="Arial" w:hAnsi="Arial"/>
@@ -5279,7 +5039,7 @@
         </w:rPr>
         <w:t xml:space="preserve">4.3 Thử bổ sung cho RabbitMQ</w:t>
       </w:r>
-      <w:bookmarkEnd w:id="1"/>
+      <w:bookmarkEnd w:id="16"/>
     </w:p>
     <w:p>
       <w:pPr>
@@ -5815,7 +5575,7 @@
         <w:keepNext/>
         <w:spacing w:after="160" w:before="360"/>
       </w:pPr>
-      <w:bookmarkStart w:name="h16" w:id="1"/>
+      <w:bookmarkStart w:name="h16" w:id="17"/>
       <w:r>
         <w:rPr>
           <w:rFonts w:ascii="Arial" w:cs="Arial" w:eastAsia="Arial" w:hAnsi="Arial"/>
@@ -5827,7 +5587,7 @@
         </w:rPr>
         <w:t xml:space="preserve">5. Còn thiếu gì</w:t>
       </w:r>
-      <w:bookmarkEnd w:id="1"/>
+      <w:bookmarkEnd w:id="17"/>
     </w:p>
     <w:tbl>
       <w:tblPr>
@@ -6486,7 +6246,7 @@
                 <w:sz w:val="28"/>
                 <w:szCs w:val="28"/>
               </w:rPr>
-              <w:t xml:space="preserve">Đo ảnh hưởng hiệu năng nhiều lần, khoảng tin cậy, khả năng tổng quát</w:t>
+              <w:t xml:space="preserve">Đo ảnh hưởng hiệu năng nhiều lần, khả năng tổng quát</w:t>
             </w:r>
           </w:p>
         </w:tc>
@@ -6601,7 +6361,7 @@
         <w:keepNext/>
         <w:spacing w:after="120" w:before="240"/>
       </w:pPr>
-      <w:bookmarkStart w:name="h17" w:id="1"/>
+      <w:bookmarkStart w:name="h17" w:id="18"/>
       <w:r>
         <w:rPr>
           <w:rFonts w:ascii="Arial" w:cs="Arial" w:eastAsia="Arial" w:hAnsi="Arial"/>
@@ -6613,7 +6373,7 @@
         </w:rPr>
         <w:t xml:space="preserve">5.1 Mục tiêu đã đăng ký</w:t>
       </w:r>
-      <w:bookmarkEnd w:id="1"/>
+      <w:bookmarkEnd w:id="18"/>
     </w:p>
     <w:p>
       <w:pPr>
@@ -6713,7 +6473,7 @@
         <w:keepNext/>
         <w:spacing w:after="120" w:before="240"/>
       </w:pPr>
-      <w:bookmarkStart w:name="h18" w:id="1"/>
+      <w:bookmarkStart w:name="h18" w:id="19"/>
       <w:r>
         <w:rPr>
           <w:rFonts w:ascii="Arial" w:cs="Arial" w:eastAsia="Arial" w:hAnsi="Arial"/>
@@ -6725,7 +6485,7 @@
         </w:rPr>
         <w:t xml:space="preserve">5.2 Nguyên tắc</w:t>
       </w:r>
-      <w:bookmarkEnd w:id="1"/>
+      <w:bookmarkEnd w:id="19"/>
     </w:p>
     <w:p>
       <w:pPr>
@@ -6771,7 +6531,7 @@
         <w:keepNext/>
         <w:spacing w:after="160" w:before="360"/>
       </w:pPr>
-      <w:bookmarkStart w:name="h19" w:id="1"/>
+      <w:bookmarkStart w:name="h19" w:id="20"/>
       <w:r>
         <w:rPr>
           <w:rFonts w:ascii="Arial" w:cs="Arial" w:eastAsia="Arial" w:hAnsi="Arial"/>
@@ -6783,7 +6543,7 @@
         </w:rPr>
         <w:t xml:space="preserve">6. Giải thích thuật ngữ</w:t>
       </w:r>
-      <w:bookmarkEnd w:id="1"/>
+      <w:bookmarkEnd w:id="20"/>
     </w:p>
     <w:tbl>
       <w:tblPr>
@@ -7820,7 +7580,7 @@
         <w:keepNext/>
         <w:spacing w:after="160" w:before="360"/>
       </w:pPr>
-      <w:bookmarkStart w:name="h20" w:id="1"/>
+      <w:bookmarkStart w:name="h20" w:id="21"/>
       <w:r>
         <w:rPr>
           <w:rFonts w:ascii="Arial" w:cs="Arial" w:eastAsia="Arial" w:hAnsi="Arial"/>
@@ -7832,7 +7592,7 @@
         </w:rPr>
         <w:t xml:space="preserve">7. Tài liệu tham chiếu</w:t>
       </w:r>
-      <w:bookmarkEnd w:id="1"/>
+      <w:bookmarkEnd w:id="21"/>
     </w:p>
     <w:p>
       <w:pPr>
@@ -7840,7 +7600,7 @@
         <w:keepNext/>
         <w:spacing w:after="120" w:before="240"/>
       </w:pPr>
-      <w:bookmarkStart w:name="h21" w:id="1"/>
+      <w:bookmarkStart w:name="h21" w:id="22"/>
       <w:r>
         <w:rPr>
           <w:rFonts w:ascii="Arial" w:cs="Arial" w:eastAsia="Arial" w:hAnsi="Arial"/>
@@ -7852,7 +7612,7 @@
         </w:rPr>
         <w:t xml:space="preserve">7.1 Mã nguồn và kết quả</w:t>
       </w:r>
-      <w:bookmarkEnd w:id="1"/>
+      <w:bookmarkEnd w:id="22"/>
     </w:p>
     <w:p>
       <w:pPr>
@@ -8166,7 +7926,7 @@
         <w:keepNext/>
         <w:spacing w:after="120" w:before="240"/>
       </w:pPr>
-      <w:bookmarkStart w:name="h22" w:id="1"/>
+      <w:bookmarkStart w:name="h22" w:id="23"/>
       <w:r>
         <w:rPr>
           <w:rFonts w:ascii="Arial" w:cs="Arial" w:eastAsia="Arial" w:hAnsi="Arial"/>
@@ -8178,7 +7938,7 @@
         </w:rPr>
         <w:t xml:space="preserve">7.2 Lệnh kiểm tra (chỉ đọc, không khởi động lại)</w:t>
       </w:r>
-      <w:bookmarkEnd w:id="1"/>
+      <w:bookmarkEnd w:id="23"/>
     </w:p>
     <w:p>
       <w:pPr>
@@ -8252,7 +8012,7 @@
         <w:keepNext/>
         <w:spacing w:after="160" w:before="360"/>
       </w:pPr>
-      <w:bookmarkStart w:name="h23" w:id="1"/>
+      <w:bookmarkStart w:name="h23" w:id="24"/>
       <w:r>
         <w:rPr>
           <w:rFonts w:ascii="Arial" w:cs="Arial" w:eastAsia="Arial" w:hAnsi="Arial"/>
@@ -8264,7 +8024,7 @@
         </w:rPr>
         <w:t xml:space="preserve">8. Lưu ý khi đọc kết quả</w:t>
       </w:r>
-      <w:bookmarkEnd w:id="1"/>
+      <w:bookmarkEnd w:id="24"/>
     </w:p>
     <w:p>
       <w:pPr>

</xml_diff>